<commit_message>
entrega final (puli errores)
</commit_message>
<xml_diff>
--- a/ManualDeUsuarioProyecto2COMPI1_202200092.docx
+++ b/ManualDeUsuarioProyecto2COMPI1_202200092.docx
@@ -1158,10 +1158,7 @@
         <w:t xml:space="preserve"> </w:t>
       </w:r>
       <w:r>
-        <w:t>Pantalla Principal</w:t>
-      </w:r>
-      <w:r>
-        <w:t>:</w:t>
+        <w:t>Pantalla Principal:</w:t>
       </w:r>
     </w:p>
     <w:p>
@@ -1187,6 +1184,9 @@
         <w:tab/>
       </w:r>
       <w:r>
+        <w:rPr>
+          <w:noProof/>
+        </w:rPr>
         <w:drawing>
           <wp:inline distT="0" distB="0" distL="0" distR="0" wp14:anchorId="2C25EF97" wp14:editId="033CF6FA">
             <wp:extent cx="5982226" cy="2992120"/>
@@ -1230,10 +1230,7 @@
         <w:ind w:firstLine="720"/>
       </w:pPr>
       <w:r>
-        <w:t xml:space="preserve">2) </w:t>
-      </w:r>
-      <w:r>
-        <w:t>Escribir y Ejecutar</w:t>
+        <w:t>2) Escribir y Ejecutar</w:t>
       </w:r>
     </w:p>
     <w:p>
@@ -1262,6 +1259,9 @@
         <w:ind w:left="720"/>
       </w:pPr>
       <w:r>
+        <w:rPr>
+          <w:noProof/>
+        </w:rPr>
         <w:drawing>
           <wp:inline distT="0" distB="0" distL="0" distR="0" wp14:anchorId="408F0018" wp14:editId="054188C3">
             <wp:extent cx="5429250" cy="2748444"/>
@@ -1316,10 +1316,7 @@
       </w:pPr>
       <w:r>
         <w:lastRenderedPageBreak/>
-        <w:t xml:space="preserve">3) </w:t>
-      </w:r>
-      <w:r>
-        <w:t>Revisión de Reportes</w:t>
+        <w:t>3) Revisión de Reportes</w:t>
       </w:r>
     </w:p>
     <w:p>
@@ -1340,6 +1337,9 @@
         <w:ind w:left="720"/>
       </w:pPr>
       <w:r>
+        <w:rPr>
+          <w:noProof/>
+        </w:rPr>
         <w:drawing>
           <wp:inline distT="0" distB="0" distL="0" distR="0" wp14:anchorId="602DD5E8" wp14:editId="59740AF5">
             <wp:extent cx="4725059" cy="1028844"/>
@@ -1408,6 +1408,9 @@
         <w:ind w:left="720"/>
       </w:pPr>
       <w:r>
+        <w:rPr>
+          <w:noProof/>
+        </w:rPr>
         <w:drawing>
           <wp:inline distT="0" distB="0" distL="0" distR="0" wp14:anchorId="45E08D6E" wp14:editId="547B8DBB">
             <wp:extent cx="6562725" cy="2148906"/>
@@ -1468,6 +1471,9 @@
         <w:ind w:left="720"/>
       </w:pPr>
       <w:r>
+        <w:rPr>
+          <w:noProof/>
+        </w:rPr>
         <w:drawing>
           <wp:inline distT="0" distB="0" distL="0" distR="0" wp14:anchorId="0CC5AA75" wp14:editId="4A7F0E6C">
             <wp:extent cx="6143625" cy="2505027"/>
@@ -1509,33 +1515,6 @@
       <w:pPr>
         <w:ind w:left="720"/>
       </w:pPr>
-    </w:p>
-    <w:p>
-      <w:pPr>
-        <w:ind w:left="720"/>
-      </w:pPr>
-      <w:r>
-        <w:t>Pestaña Árbol AST: Te muestra la estructura interna de cómo el "cerebro" del programa desarmó tu código paso a paso para poder entenderlo.</w:t>
-      </w:r>
-    </w:p>
-    <w:p>
-      <w:pPr>
-        <w:ind w:left="720"/>
-        <w:rPr>
-          <w:lang w:val="es-GT"/>
-        </w:rPr>
-      </w:pPr>
-      <w:r>
-        <w:t xml:space="preserve">[Aquí pegas la captura de la pestaña del AST / </w:t>
-      </w:r>
-      <w:proofErr w:type="spellStart"/>
-      <w:r>
-        <w:t>Graphviz</w:t>
-      </w:r>
-      <w:proofErr w:type="spellEnd"/>
-      <w:r>
-        <w:t>]</w:t>
-      </w:r>
     </w:p>
     <w:p>
       <w:pPr>

</xml_diff>